<commit_message>
I made a few necessary consistency updates to the project files. I mainly changed the retrieval description from FAISS to an in-memory NumPy embedding matrix with cosine similarity, since the code does not actually use FAISS. I also updated the token-counting description to “approximate token-aware chunking” instead of saying we use tiktoken directly. The hard allow-list filtering is now described as happening before answer generation, so it matches the section-scoped RAG design. Just check if these changes are neccessary. If not, delet it.
</commit_message>
<xml_diff>
--- a/Milestone1_Design_Brief.docx
+++ b/Milestone1_Design_Brief.docx
@@ -82,12 +82,6 @@
         <w:gridCol w:w="7020"/>
       </w:tblGrid>
       <w:tr>
-        <w:tblPrEx>
-          <w:tblCellMar>
-            <w:top w:w="0" w:type="dxa"/>
-            <w:bottom w:w="0" w:type="dxa"/>
-          </w:tblCellMar>
-        </w:tblPrEx>
         <w:tc>
           <w:tcPr>
             <w:tcW w:w="2340" w:type="dxa"/>
@@ -133,18 +127,17 @@
           </w:tcPr>
           <w:p>
             <w:r>
-              <w:t>[ Team name — add before submission ]</w:t>
-            </w:r>
+              <w:t xml:space="preserve">[ Team name — add before </w:t>
+            </w:r>
+            <w:proofErr w:type="gramStart"/>
+            <w:r>
+              <w:t>submission ]</w:t>
+            </w:r>
+            <w:proofErr w:type="gramEnd"/>
           </w:p>
         </w:tc>
       </w:tr>
       <w:tr>
-        <w:tblPrEx>
-          <w:tblCellMar>
-            <w:top w:w="0" w:type="dxa"/>
-            <w:bottom w:w="0" w:type="dxa"/>
-          </w:tblCellMar>
-        </w:tblPrEx>
         <w:tc>
           <w:tcPr>
             <w:tcW w:w="2340" w:type="dxa"/>
@@ -189,19 +182,38 @@
             </w:tcMar>
           </w:tcPr>
           <w:p>
-            <w:r>
-              <w:t>[ Member 1 · Member 2 · Member 3 · Member 4 · Member 5 ]</w:t>
+            <w:pPr>
+              <w:rPr>
+                <w:lang w:eastAsia="zh-CN"/>
+              </w:rPr>
+            </w:pPr>
+            <w:r>
+              <w:t>Suleyman Zeybekci</w:t>
+            </w:r>
+            <w:r>
+              <w:rPr>
+                <w:rFonts w:hint="eastAsia"/>
+                <w:lang w:eastAsia="zh-CN"/>
+              </w:rPr>
+              <w:t xml:space="preserve">, </w:t>
+            </w:r>
+            <w:r>
+              <w:rPr>
+                <w:lang w:eastAsia="zh-CN"/>
+              </w:rPr>
+              <w:t>Aston Justus</w:t>
+            </w:r>
+            <w:r>
+              <w:rPr>
+                <w:rFonts w:hint="eastAsia"/>
+                <w:lang w:eastAsia="zh-CN"/>
+              </w:rPr>
+              <w:t>, Annabella Xu</w:t>
             </w:r>
           </w:p>
         </w:tc>
       </w:tr>
       <w:tr>
-        <w:tblPrEx>
-          <w:tblCellMar>
-            <w:top w:w="0" w:type="dxa"/>
-            <w:bottom w:w="0" w:type="dxa"/>
-          </w:tblCellMar>
-        </w:tblPrEx>
         <w:tc>
           <w:tcPr>
             <w:tcW w:w="2340" w:type="dxa"/>
@@ -253,12 +265,6 @@
         </w:tc>
       </w:tr>
       <w:tr>
-        <w:tblPrEx>
-          <w:tblCellMar>
-            <w:top w:w="0" w:type="dxa"/>
-            <w:bottom w:w="0" w:type="dxa"/>
-          </w:tblCellMar>
-        </w:tblPrEx>
         <w:tc>
           <w:tcPr>
             <w:tcW w:w="2340" w:type="dxa"/>
@@ -310,12 +316,6 @@
         </w:tc>
       </w:tr>
       <w:tr>
-        <w:tblPrEx>
-          <w:tblCellMar>
-            <w:top w:w="0" w:type="dxa"/>
-            <w:bottom w:w="0" w:type="dxa"/>
-          </w:tblCellMar>
-        </w:tblPrEx>
         <w:tc>
           <w:tcPr>
             <w:tcW w:w="2340" w:type="dxa"/>
@@ -367,12 +367,6 @@
         </w:tc>
       </w:tr>
       <w:tr>
-        <w:tblPrEx>
-          <w:tblCellMar>
-            <w:top w:w="0" w:type="dxa"/>
-            <w:bottom w:w="0" w:type="dxa"/>
-          </w:tblCellMar>
-        </w:tblPrEx>
         <w:tc>
           <w:tcPr>
             <w:tcW w:w="2340" w:type="dxa"/>
@@ -424,12 +418,6 @@
         </w:tc>
       </w:tr>
       <w:tr>
-        <w:tblPrEx>
-          <w:tblCellMar>
-            <w:top w:w="0" w:type="dxa"/>
-            <w:bottom w:w="0" w:type="dxa"/>
-          </w:tblCellMar>
-        </w:tblPrEx>
         <w:tc>
           <w:tcPr>
             <w:tcW w:w="2340" w:type="dxa"/>
@@ -481,12 +469,6 @@
         </w:tc>
       </w:tr>
       <w:tr>
-        <w:tblPrEx>
-          <w:tblCellMar>
-            <w:top w:w="0" w:type="dxa"/>
-            <w:bottom w:w="0" w:type="dxa"/>
-          </w:tblCellMar>
-        </w:tblPrEx>
         <w:tc>
           <w:tcPr>
             <w:tcW w:w="2340" w:type="dxa"/>
@@ -600,12 +582,6 @@
         <w:gridCol w:w="4760"/>
       </w:tblGrid>
       <w:tr>
-        <w:tblPrEx>
-          <w:tblCellMar>
-            <w:top w:w="0" w:type="dxa"/>
-            <w:bottom w:w="0" w:type="dxa"/>
-          </w:tblCellMar>
-        </w:tblPrEx>
         <w:tc>
           <w:tcPr>
             <w:tcW w:w="1400" w:type="dxa"/>
@@ -689,12 +665,6 @@
         </w:tc>
       </w:tr>
       <w:tr>
-        <w:tblPrEx>
-          <w:tblCellMar>
-            <w:top w:w="0" w:type="dxa"/>
-            <w:bottom w:w="0" w:type="dxa"/>
-          </w:tblCellMar>
-        </w:tblPrEx>
         <w:tc>
           <w:tcPr>
             <w:tcW w:w="1400" w:type="dxa"/>
@@ -767,12 +737,6 @@
         </w:tc>
       </w:tr>
       <w:tr>
-        <w:tblPrEx>
-          <w:tblCellMar>
-            <w:top w:w="0" w:type="dxa"/>
-            <w:bottom w:w="0" w:type="dxa"/>
-          </w:tblCellMar>
-        </w:tblPrEx>
         <w:tc>
           <w:tcPr>
             <w:tcW w:w="1400" w:type="dxa"/>
@@ -845,12 +809,6 @@
         </w:tc>
       </w:tr>
       <w:tr>
-        <w:tblPrEx>
-          <w:tblCellMar>
-            <w:top w:w="0" w:type="dxa"/>
-            <w:bottom w:w="0" w:type="dxa"/>
-          </w:tblCellMar>
-        </w:tblPrEx>
         <w:tc>
           <w:tcPr>
             <w:tcW w:w="1400" w:type="dxa"/>
@@ -923,12 +881,6 @@
         </w:tc>
       </w:tr>
       <w:tr>
-        <w:tblPrEx>
-          <w:tblCellMar>
-            <w:top w:w="0" w:type="dxa"/>
-            <w:bottom w:w="0" w:type="dxa"/>
-          </w:tblCellMar>
-        </w:tblPrEx>
         <w:tc>
           <w:tcPr>
             <w:tcW w:w="1400" w:type="dxa"/>
@@ -1012,7 +964,15 @@
         <w:spacing w:after="120"/>
       </w:pPr>
       <w:r>
-        <w:t>Together these four Items cover the entire Part II "Financial Information and Market Risk" block of Form 10-K and form a coherent retrieval scope — anything the user asks about financial performance or market risk should be answerable from somewhere in this scope, and nothing outside it should be needed.</w:t>
+        <w:t xml:space="preserve">Together these four Items cover the entire Part II "Financial Information and Market Risk" block of Form 10-K and form a coherent retrieval scope — anything the user asks about financial </w:t>
+      </w:r>
+      <w:proofErr w:type="gramStart"/>
+      <w:r>
+        <w:t>performance</w:t>
+      </w:r>
+      <w:proofErr w:type="gramEnd"/>
+      <w:r>
+        <w:t xml:space="preserve"> or market risk should be answerable from somewhere in this scope, and nothing outside it should be needed.</w:t>
       </w:r>
     </w:p>
     <w:p>
@@ -1130,7 +1090,15 @@
         <w:spacing w:after="60"/>
       </w:pPr>
       <w:r>
-        <w:t>Business strategy, product-line, or R&amp;D roadmap (lives in Item 1).</w:t>
+        <w:t xml:space="preserve">Business strategy, </w:t>
+      </w:r>
+      <w:proofErr w:type="gramStart"/>
+      <w:r>
+        <w:t>product-line</w:t>
+      </w:r>
+      <w:proofErr w:type="gramEnd"/>
+      <w:r>
+        <w:t>, or R&amp;D roadmap (lives in Item 1).</w:t>
       </w:r>
     </w:p>
     <w:p>
@@ -1156,7 +1124,15 @@
         <w:spacing w:after="60"/>
       </w:pPr>
       <w:r>
-        <w:t>Legal proceedings (Item 3) — even if financially material.</w:t>
+        <w:t xml:space="preserve">Legal proceedings (Item </w:t>
+      </w:r>
+      <w:proofErr w:type="gramStart"/>
+      <w:r>
+        <w:t>3) —</w:t>
+      </w:r>
+      <w:proofErr w:type="gramEnd"/>
+      <w:r>
+        <w:t xml:space="preserve"> even if financially material.</w:t>
       </w:r>
     </w:p>
     <w:p>
@@ -1212,7 +1188,25 @@
         <w:spacing w:after="120"/>
       </w:pPr>
       <w:r>
-        <w:t>Every chunk carries an item metadata tag. At query time, the retriever requests top-k candidates from the FAISS index and then applies a hard allow-list filter: candidate.item ∈ {Item 6, Item 7, Item 7A, Item 8}. This is a post-filter, not a soft prompt instruction — the LLM never sees out-of-scope text. The same filter is asserted again in evaluation (Section 5), which sweeps all generated answers and fails the run if any citation references an Item outside the allow-list.</w:t>
+        <w:t>Every chunk carries an item metadata tag. At query time, the retriever requests top-k candidates from the</w:t>
+      </w:r>
+      <w:r>
+        <w:rPr>
+          <w:rFonts w:hint="eastAsia"/>
+          <w:lang w:eastAsia="zh-CN"/>
+        </w:rPr>
+        <w:t xml:space="preserve"> persistent NumPy embedding matrix</w:t>
+      </w:r>
+      <w:r>
+        <w:t xml:space="preserve"> and then applies a hard allow-list filter: </w:t>
+      </w:r>
+      <w:proofErr w:type="gramStart"/>
+      <w:r>
+        <w:t>candidate.item</w:t>
+      </w:r>
+      <w:proofErr w:type="gramEnd"/>
+      <w:r>
+        <w:t xml:space="preserve"> ∈ {Item 6, Item 7, Item 7A, Item 8}. This is a post-filter, not a soft prompt instruction — the LLM never sees out-of-scope text. The same filter is asserted again in evaluation (Section 5), which sweeps all generated answers and fails the run if any citation references an Item outside the allow-list.</w:t>
       </w:r>
     </w:p>
     <w:p>
@@ -1322,7 +1316,15 @@
         <w:t xml:space="preserve">Smart-quote and non-ASCII artifacts from PDF→HTML conversion. </w:t>
       </w:r>
       <w:r>
-        <w:t>Mitigation: NFKC-normalize text and html.unescape() at load time.</w:t>
+        <w:t xml:space="preserve">Mitigation: NFKC-normalize text and </w:t>
+      </w:r>
+      <w:proofErr w:type="gramStart"/>
+      <w:r>
+        <w:t>html.unescape</w:t>
+      </w:r>
+      <w:proofErr w:type="gramEnd"/>
+      <w:r>
+        <w:t>() at load time.</w:t>
       </w:r>
     </w:p>
     <w:p>
@@ -1362,7 +1364,15 @@
         <w:t xml:space="preserve">Short-section edge case. </w:t>
       </w:r>
       <w:r>
-        <w:t>A firm with "Not applicable" under Item 7A will produce a 20-character body between items. Mitigation: skip sections under 500 characters and log them in a coverage report.</w:t>
+        <w:t xml:space="preserve">A firm with "Not applicable" under Item 7A will produce a 20-character body between items. Mitigation: skip sections under 500 characters and log them </w:t>
+      </w:r>
+      <w:proofErr w:type="gramStart"/>
+      <w:r>
+        <w:t>in</w:t>
+      </w:r>
+      <w:proofErr w:type="gramEnd"/>
+      <w:r>
+        <w:t xml:space="preserve"> a coverage report.</w:t>
       </w:r>
     </w:p>
     <w:p>
@@ -1382,7 +1392,10 @@
         <w:t xml:space="preserve">Boilerplate forward-looking-statement disclaimers. </w:t>
       </w:r>
       <w:r>
-        <w:t>Present at the top of MD&amp;A in many firms, repeating across the corpus. They do not carry firm-specific signal and will cluster in retrieval results for generic questions. Mitigation: noted for a later cleaning pass; not removed in M1 because the text is legitimately in the section.</w:t>
+        <w:t xml:space="preserve">Present at the top of MD&amp;A in many firms, repeating across the corpus. They do not carry firm-specific signal and will cluster in retrieval results for generic questions. </w:t>
+      </w:r>
+      <w:r>
+        <w:t>Mitigation: kept in the current corpus because it is legitimately within the section; the limitation is documented and can be reduced in a future boilerplate-filtering pass.</w:t>
       </w:r>
     </w:p>
     <w:p>
@@ -1411,7 +1424,15 @@
         <w:t xml:space="preserve">Cross-firm contamination. </w:t>
       </w:r>
       <w:r>
-        <w:t>A question like "How does liquidity look?" should return chunks for the specific firm in focus, not the best semantically matching chunk from any firm. Mitigation: the Milestone 4 run scopes each question to one firm at a time via an injected "(Firm: X)" suffix; a later iteration will add metadata filtering on ticker/CIK.</w:t>
+        <w:t xml:space="preserve">A question like "How does liquidity look?" should return chunks for the specific firm in focus, not the best semantically matching chunk from any firm. Mitigation: </w:t>
+      </w:r>
+      <w:proofErr w:type="gramStart"/>
+      <w:r>
+        <w:t>the Milestone</w:t>
+      </w:r>
+      <w:proofErr w:type="gramEnd"/>
+      <w:r>
+        <w:t xml:space="preserve"> 4 run scopes each question to one firm at a time via an injected "(Firm: X)" suffix; a later iteration will add metadata filtering on ticker/CIK.</w:t>
       </w:r>
     </w:p>
     <w:p>
@@ -1431,7 +1452,29 @@
         <w:t xml:space="preserve">Parametric-knowledge leakage in generation. </w:t>
       </w:r>
       <w:r>
-        <w:t>LLMs trained on the public web have seen 10-K boilerplate and may answer from memory even with strict prompts. Mitigation: temperature 0, enforced JSON schema with "refused" field, refusal when top-1 similarity &lt; 0.20, and an LLM-as-judge hallucination spot-check that compares each answer against the cited chunk text.</w:t>
+        <w:t xml:space="preserve">LLMs trained on public web data may answer from memory even when the retrieved evidence is weak. Mitigation: use temperature 0, enforce a JSON schema with a “refused” field, refuse when </w:t>
+      </w:r>
+      <w:proofErr w:type="gramStart"/>
+      <w:r>
+        <w:t>top-1</w:t>
+      </w:r>
+      <w:proofErr w:type="gramEnd"/>
+      <w:r>
+        <w:t xml:space="preserve"> similarity &lt; 0.20, and conduct </w:t>
+      </w:r>
+      <w:proofErr w:type="gramStart"/>
+      <w:r>
+        <w:t>a</w:t>
+      </w:r>
+      <w:proofErr w:type="gramEnd"/>
+      <w:r>
+        <w:t xml:space="preserve"> </w:t>
+      </w:r>
+      <w:r>
+        <w:t>LLM-as-judge hallucination</w:t>
+      </w:r>
+      <w:r>
+        <w:t xml:space="preserve"> spot-check by comparing each sampled answer against its cited chunk text.</w:t>
       </w:r>
     </w:p>
     <w:p>
@@ -1451,7 +1494,31 @@
         <w:t xml:space="preserve">Over-retrieval of generic forward-looking disclaimers. </w:t>
       </w:r>
       <w:r>
-        <w:t>Every firm repeats the same risk-language preamble. These chunks are high-similarity against almost any risk question. Mitigation: monitor top-1 chunks in eval; if dominated by this boilerplate, add a rule to boost chunks whose embedding distance from a "boilerplate centroid" exceeds a threshold.</w:t>
+        <w:t xml:space="preserve">Every firm repeats the same risk-language preamble. These chunks are </w:t>
+      </w:r>
+      <w:proofErr w:type="gramStart"/>
+      <w:r>
+        <w:t>high-similarity</w:t>
+      </w:r>
+      <w:proofErr w:type="gramEnd"/>
+      <w:r>
+        <w:t xml:space="preserve"> </w:t>
+      </w:r>
+      <w:proofErr w:type="gramStart"/>
+      <w:r>
+        <w:t>against</w:t>
+      </w:r>
+      <w:proofErr w:type="gramEnd"/>
+      <w:r>
+        <w:t xml:space="preserve"> almost any risk question. Mitigation: monitor </w:t>
+      </w:r>
+      <w:proofErr w:type="gramStart"/>
+      <w:r>
+        <w:t>top-1</w:t>
+      </w:r>
+      <w:proofErr w:type="gramEnd"/>
+      <w:r>
+        <w:t xml:space="preserve"> chunks in eval; if dominated by this boilerplate, add a rule to boost chunks whose embedding distance from a "boilerplate centroid" exceeds a threshold.</w:t>
       </w:r>
     </w:p>
     <w:p>
@@ -1534,12 +1601,6 @@
         <w:gridCol w:w="7160"/>
       </w:tblGrid>
       <w:tr>
-        <w:tblPrEx>
-          <w:tblCellMar>
-            <w:top w:w="0" w:type="dxa"/>
-            <w:bottom w:w="0" w:type="dxa"/>
-          </w:tblCellMar>
-        </w:tblPrEx>
         <w:tc>
           <w:tcPr>
             <w:tcW w:w="800" w:type="dxa"/>
@@ -1623,12 +1684,6 @@
         </w:tc>
       </w:tr>
       <w:tr>
-        <w:tblPrEx>
-          <w:tblCellMar>
-            <w:top w:w="0" w:type="dxa"/>
-            <w:bottom w:w="0" w:type="dxa"/>
-          </w:tblCellMar>
-        </w:tblPrEx>
         <w:tc>
           <w:tcPr>
             <w:tcW w:w="800" w:type="dxa"/>
@@ -1698,12 +1753,6 @@
         </w:tc>
       </w:tr>
       <w:tr>
-        <w:tblPrEx>
-          <w:tblCellMar>
-            <w:top w:w="0" w:type="dxa"/>
-            <w:bottom w:w="0" w:type="dxa"/>
-          </w:tblCellMar>
-        </w:tblPrEx>
         <w:tc>
           <w:tcPr>
             <w:tcW w:w="800" w:type="dxa"/>
@@ -1772,12 +1821,6 @@
         </w:tc>
       </w:tr>
       <w:tr>
-        <w:tblPrEx>
-          <w:tblCellMar>
-            <w:top w:w="0" w:type="dxa"/>
-            <w:bottom w:w="0" w:type="dxa"/>
-          </w:tblCellMar>
-        </w:tblPrEx>
         <w:tc>
           <w:tcPr>
             <w:tcW w:w="800" w:type="dxa"/>
@@ -1846,12 +1889,6 @@
         </w:tc>
       </w:tr>
       <w:tr>
-        <w:tblPrEx>
-          <w:tblCellMar>
-            <w:top w:w="0" w:type="dxa"/>
-            <w:bottom w:w="0" w:type="dxa"/>
-          </w:tblCellMar>
-        </w:tblPrEx>
         <w:tc>
           <w:tcPr>
             <w:tcW w:w="800" w:type="dxa"/>
@@ -1920,12 +1957,6 @@
         </w:tc>
       </w:tr>
       <w:tr>
-        <w:tblPrEx>
-          <w:tblCellMar>
-            <w:top w:w="0" w:type="dxa"/>
-            <w:bottom w:w="0" w:type="dxa"/>
-          </w:tblCellMar>
-        </w:tblPrEx>
         <w:tc>
           <w:tcPr>
             <w:tcW w:w="800" w:type="dxa"/>
@@ -1994,12 +2025,6 @@
         </w:tc>
       </w:tr>
       <w:tr>
-        <w:tblPrEx>
-          <w:tblCellMar>
-            <w:top w:w="0" w:type="dxa"/>
-            <w:bottom w:w="0" w:type="dxa"/>
-          </w:tblCellMar>
-        </w:tblPrEx>
         <w:tc>
           <w:tcPr>
             <w:tcW w:w="800" w:type="dxa"/>
@@ -2068,12 +2093,6 @@
         </w:tc>
       </w:tr>
       <w:tr>
-        <w:tblPrEx>
-          <w:tblCellMar>
-            <w:top w:w="0" w:type="dxa"/>
-            <w:bottom w:w="0" w:type="dxa"/>
-          </w:tblCellMar>
-        </w:tblPrEx>
         <w:tc>
           <w:tcPr>
             <w:tcW w:w="800" w:type="dxa"/>
@@ -2142,12 +2161,6 @@
         </w:tc>
       </w:tr>
       <w:tr>
-        <w:tblPrEx>
-          <w:tblCellMar>
-            <w:top w:w="0" w:type="dxa"/>
-            <w:bottom w:w="0" w:type="dxa"/>
-          </w:tblCellMar>
-        </w:tblPrEx>
         <w:tc>
           <w:tcPr>
             <w:tcW w:w="800" w:type="dxa"/>
@@ -2210,18 +2223,20 @@
           </w:tcPr>
           <w:p>
             <w:r>
-              <w:t>What foreign-exchange risk is disclosed, and which currencies are named?</w:t>
+              <w:t xml:space="preserve">What </w:t>
+            </w:r>
+            <w:proofErr w:type="gramStart"/>
+            <w:r>
+              <w:t>foreign-exchange</w:t>
+            </w:r>
+            <w:proofErr w:type="gramEnd"/>
+            <w:r>
+              <w:t xml:space="preserve"> risk is disclosed, and which currencies are named?</w:t>
             </w:r>
           </w:p>
         </w:tc>
       </w:tr>
       <w:tr>
-        <w:tblPrEx>
-          <w:tblCellMar>
-            <w:top w:w="0" w:type="dxa"/>
-            <w:bottom w:w="0" w:type="dxa"/>
-          </w:tblCellMar>
-        </w:tblPrEx>
         <w:tc>
           <w:tcPr>
             <w:tcW w:w="800" w:type="dxa"/>
@@ -2290,12 +2305,6 @@
         </w:tc>
       </w:tr>
       <w:tr>
-        <w:tblPrEx>
-          <w:tblCellMar>
-            <w:top w:w="0" w:type="dxa"/>
-            <w:bottom w:w="0" w:type="dxa"/>
-          </w:tblCellMar>
-        </w:tblPrEx>
         <w:tc>
           <w:tcPr>
             <w:tcW w:w="800" w:type="dxa"/>
@@ -2364,12 +2373,6 @@
         </w:tc>
       </w:tr>
       <w:tr>
-        <w:tblPrEx>
-          <w:tblCellMar>
-            <w:top w:w="0" w:type="dxa"/>
-            <w:bottom w:w="0" w:type="dxa"/>
-          </w:tblCellMar>
-        </w:tblPrEx>
         <w:tc>
           <w:tcPr>
             <w:tcW w:w="800" w:type="dxa"/>
@@ -2438,12 +2441,6 @@
         </w:tc>
       </w:tr>
       <w:tr>
-        <w:tblPrEx>
-          <w:tblCellMar>
-            <w:top w:w="0" w:type="dxa"/>
-            <w:bottom w:w="0" w:type="dxa"/>
-          </w:tblCellMar>
-        </w:tblPrEx>
         <w:tc>
           <w:tcPr>
             <w:tcW w:w="800" w:type="dxa"/>
@@ -2512,12 +2509,6 @@
         </w:tc>
       </w:tr>
       <w:tr>
-        <w:tblPrEx>
-          <w:tblCellMar>
-            <w:top w:w="0" w:type="dxa"/>
-            <w:bottom w:w="0" w:type="dxa"/>
-          </w:tblCellMar>
-        </w:tblPrEx>
         <w:tc>
           <w:tcPr>
             <w:tcW w:w="800" w:type="dxa"/>
@@ -2580,18 +2571,20 @@
           </w:tcPr>
           <w:p>
             <w:r>
-              <w:t>What are the stated income-tax rate and the reconciling items to the statutory rate?</w:t>
+              <w:t xml:space="preserve">What </w:t>
+            </w:r>
+            <w:proofErr w:type="gramStart"/>
+            <w:r>
+              <w:t>are</w:t>
+            </w:r>
+            <w:proofErr w:type="gramEnd"/>
+            <w:r>
+              <w:t xml:space="preserve"> the stated income-tax rate and the reconciling items to the statutory rate?</w:t>
             </w:r>
           </w:p>
         </w:tc>
       </w:tr>
       <w:tr>
-        <w:tblPrEx>
-          <w:tblCellMar>
-            <w:top w:w="0" w:type="dxa"/>
-            <w:bottom w:w="0" w:type="dxa"/>
-          </w:tblCellMar>
-        </w:tblPrEx>
         <w:tc>
           <w:tcPr>
             <w:tcW w:w="800" w:type="dxa"/>
@@ -2660,12 +2653,6 @@
         </w:tc>
       </w:tr>
       <w:tr>
-        <w:tblPrEx>
-          <w:tblCellMar>
-            <w:top w:w="0" w:type="dxa"/>
-            <w:bottom w:w="0" w:type="dxa"/>
-          </w:tblCellMar>
-        </w:tblPrEx>
         <w:tc>
           <w:tcPr>
             <w:tcW w:w="800" w:type="dxa"/>
@@ -2728,7 +2715,15 @@
           </w:tcPr>
           <w:p>
             <w:r>
-              <w:t>Does the auditor flag any critical audit matters, and what do they relate to?</w:t>
+              <w:t xml:space="preserve">Does the auditor flag any critical audit </w:t>
+            </w:r>
+            <w:proofErr w:type="gramStart"/>
+            <w:r>
+              <w:t>matters</w:t>
+            </w:r>
+            <w:proofErr w:type="gramEnd"/>
+            <w:r>
+              <w:t>, and what do they relate to?</w:t>
             </w:r>
           </w:p>
         </w:tc>
@@ -2759,6 +2754,10 @@
     <w:p>
       <w:pPr>
         <w:spacing w:after="120"/>
+        <w:rPr>
+          <w:rFonts w:hint="eastAsia"/>
+          <w:lang w:eastAsia="zh-CN"/>
+        </w:rPr>
       </w:pPr>
       <w:r>
         <w:rPr>
@@ -2864,35 +2863,25 @@
           <w:sz w:val="18"/>
           <w:szCs w:val="18"/>
         </w:rPr>
-        <w:t xml:space="preserve">                          [M2] Token-aware chunks (≈500 tok, 50 overlap)   </w:t>
-      </w:r>
-      <w:r>
-        <w:rPr>
-          <w:rFonts w:ascii="Consolas" w:eastAsia="Consolas" w:hAnsi="Consolas" w:cs="Consolas"/>
-        </w:rPr>
-        <w:br/>
-      </w:r>
+        <w:t xml:space="preserve">                          [M2] Token-aware chunks (≈500 </w:t>
+      </w:r>
+      <w:proofErr w:type="spellStart"/>
       <w:r>
         <w:rPr>
           <w:rFonts w:ascii="Consolas" w:eastAsia="Consolas" w:hAnsi="Consolas" w:cs="Consolas"/>
           <w:sz w:val="18"/>
           <w:szCs w:val="18"/>
         </w:rPr>
-        <w:t xml:space="preserve">                          + metadata (cik, ticker, year, item, chunk_id)   </w:t>
-      </w:r>
-      <w:r>
-        <w:rPr>
-          <w:rFonts w:ascii="Consolas" w:eastAsia="Consolas" w:hAnsi="Consolas" w:cs="Consolas"/>
-        </w:rPr>
-        <w:br/>
-      </w:r>
+        <w:t>tok</w:t>
+      </w:r>
+      <w:proofErr w:type="spellEnd"/>
       <w:r>
         <w:rPr>
           <w:rFonts w:ascii="Consolas" w:eastAsia="Consolas" w:hAnsi="Consolas" w:cs="Consolas"/>
           <w:sz w:val="18"/>
           <w:szCs w:val="18"/>
         </w:rPr>
-        <w:t xml:space="preserve">                                │                                          </w:t>
+        <w:t xml:space="preserve">, 50 overlap)   </w:t>
       </w:r>
       <w:r>
         <w:rPr>
@@ -2906,34 +2895,116 @@
           <w:sz w:val="18"/>
           <w:szCs w:val="18"/>
         </w:rPr>
-        <w:t xml:space="preserve">                                ▼                                          </w:t>
-      </w:r>
-      <w:r>
-        <w:rPr>
-          <w:rFonts w:ascii="Consolas" w:eastAsia="Consolas" w:hAnsi="Consolas" w:cs="Consolas"/>
-        </w:rPr>
-        <w:br/>
-      </w:r>
+        <w:t xml:space="preserve">                          + metadata (</w:t>
+      </w:r>
+      <w:proofErr w:type="spellStart"/>
       <w:r>
         <w:rPr>
           <w:rFonts w:ascii="Consolas" w:eastAsia="Consolas" w:hAnsi="Consolas" w:cs="Consolas"/>
           <w:sz w:val="18"/>
           <w:szCs w:val="18"/>
         </w:rPr>
-        <w:t xml:space="preserve">                          [M3] bge-small embeddings (384-dim, cosine)      </w:t>
-      </w:r>
-      <w:r>
-        <w:rPr>
-          <w:rFonts w:ascii="Consolas" w:eastAsia="Consolas" w:hAnsi="Consolas" w:cs="Consolas"/>
-        </w:rPr>
-        <w:br/>
-      </w:r>
+        <w:t>cik</w:t>
+      </w:r>
+      <w:proofErr w:type="spellEnd"/>
       <w:r>
         <w:rPr>
           <w:rFonts w:ascii="Consolas" w:eastAsia="Consolas" w:hAnsi="Consolas" w:cs="Consolas"/>
           <w:sz w:val="18"/>
           <w:szCs w:val="18"/>
         </w:rPr>
+        <w:t xml:space="preserve">, ticker, year, item, </w:t>
+      </w:r>
+      <w:proofErr w:type="spellStart"/>
+      <w:r>
+        <w:rPr>
+          <w:rFonts w:ascii="Consolas" w:eastAsia="Consolas" w:hAnsi="Consolas" w:cs="Consolas"/>
+          <w:sz w:val="18"/>
+          <w:szCs w:val="18"/>
+        </w:rPr>
+        <w:t>chunk_id</w:t>
+      </w:r>
+      <w:proofErr w:type="spellEnd"/>
+      <w:r>
+        <w:rPr>
+          <w:rFonts w:ascii="Consolas" w:eastAsia="Consolas" w:hAnsi="Consolas" w:cs="Consolas"/>
+          <w:sz w:val="18"/>
+          <w:szCs w:val="18"/>
+        </w:rPr>
+        <w:t xml:space="preserve">)   </w:t>
+      </w:r>
+      <w:r>
+        <w:rPr>
+          <w:rFonts w:ascii="Consolas" w:eastAsia="Consolas" w:hAnsi="Consolas" w:cs="Consolas"/>
+        </w:rPr>
+        <w:br/>
+      </w:r>
+      <w:r>
+        <w:rPr>
+          <w:rFonts w:ascii="Consolas" w:eastAsia="Consolas" w:hAnsi="Consolas" w:cs="Consolas"/>
+          <w:sz w:val="18"/>
+          <w:szCs w:val="18"/>
+        </w:rPr>
+        <w:t xml:space="preserve">                                │                                          </w:t>
+      </w:r>
+      <w:r>
+        <w:rPr>
+          <w:rFonts w:ascii="Consolas" w:eastAsia="Consolas" w:hAnsi="Consolas" w:cs="Consolas"/>
+        </w:rPr>
+        <w:br/>
+      </w:r>
+      <w:r>
+        <w:rPr>
+          <w:rFonts w:ascii="Consolas" w:eastAsia="Consolas" w:hAnsi="Consolas" w:cs="Consolas"/>
+          <w:sz w:val="18"/>
+          <w:szCs w:val="18"/>
+        </w:rPr>
+        <w:t xml:space="preserve">                                ▼                                          </w:t>
+      </w:r>
+      <w:r>
+        <w:rPr>
+          <w:rFonts w:ascii="Consolas" w:eastAsia="Consolas" w:hAnsi="Consolas" w:cs="Consolas"/>
+        </w:rPr>
+        <w:br/>
+      </w:r>
+      <w:r>
+        <w:rPr>
+          <w:rFonts w:ascii="Consolas" w:eastAsia="Consolas" w:hAnsi="Consolas" w:cs="Consolas"/>
+          <w:sz w:val="18"/>
+          <w:szCs w:val="18"/>
+        </w:rPr>
+        <w:t xml:space="preserve">                          [M3] </w:t>
+      </w:r>
+      <w:proofErr w:type="spellStart"/>
+      <w:r>
+        <w:rPr>
+          <w:rFonts w:ascii="Consolas" w:eastAsia="Consolas" w:hAnsi="Consolas" w:cs="Consolas"/>
+          <w:sz w:val="18"/>
+          <w:szCs w:val="18"/>
+        </w:rPr>
+        <w:t>bge</w:t>
+      </w:r>
+      <w:proofErr w:type="spellEnd"/>
+      <w:r>
+        <w:rPr>
+          <w:rFonts w:ascii="Consolas" w:eastAsia="Consolas" w:hAnsi="Consolas" w:cs="Consolas"/>
+          <w:sz w:val="18"/>
+          <w:szCs w:val="18"/>
+        </w:rPr>
+        <w:t xml:space="preserve">-small embeddings (384-dim, cosine)      </w:t>
+      </w:r>
+      <w:r>
+        <w:rPr>
+          <w:rFonts w:ascii="Consolas" w:eastAsia="Consolas" w:hAnsi="Consolas" w:cs="Consolas"/>
+        </w:rPr>
+        <w:br/>
+      </w:r>
+      <w:r>
+        <w:rPr>
+          <w:rFonts w:ascii="Consolas" w:eastAsia="Consolas" w:hAnsi="Consolas" w:cs="Consolas"/>
+          <w:sz w:val="18"/>
+          <w:szCs w:val="18"/>
+        </w:rPr>
         <w:lastRenderedPageBreak/>
         <w:t xml:space="preserve">                                │                                          </w:t>
       </w:r>
@@ -2963,13 +3034,7 @@
           <w:sz w:val="18"/>
           <w:szCs w:val="18"/>
         </w:rPr>
-        <w:t xml:space="preserve">                          FAISS IndexFlatIP                                </w:t>
-      </w:r>
-      <w:r>
-        <w:rPr>
-          <w:rFonts w:ascii="Consolas" w:eastAsia="Consolas" w:hAnsi="Consolas" w:cs="Consolas"/>
-        </w:rPr>
-        <w:br/>
+        <w:t xml:space="preserve">                          </w:t>
       </w:r>
       <w:r>
         <w:rPr>
@@ -2977,13 +3042,7 @@
           <w:sz w:val="18"/>
           <w:szCs w:val="18"/>
         </w:rPr>
-        <w:t xml:space="preserve">                                │                                          </w:t>
-      </w:r>
-      <w:r>
-        <w:rPr>
-          <w:rFonts w:ascii="Consolas" w:eastAsia="Consolas" w:hAnsi="Consolas" w:cs="Consolas"/>
-        </w:rPr>
-        <w:br/>
+        <w:t>cosine-similarity</w:t>
       </w:r>
       <w:r>
         <w:rPr>
@@ -2991,27 +3050,16 @@
           <w:sz w:val="18"/>
           <w:szCs w:val="18"/>
         </w:rPr>
-        <w:t xml:space="preserve">   question ───▶  embed ──────▶ search  ──▶ filter: item ∈ allow-list      </w:t>
-      </w:r>
-      <w:r>
-        <w:rPr>
-          <w:rFonts w:ascii="Consolas" w:eastAsia="Consolas" w:hAnsi="Consolas" w:cs="Consolas"/>
-        </w:rPr>
-        <w:br/>
-      </w:r>
-      <w:r>
-        <w:rPr>
-          <w:rFonts w:ascii="Consolas" w:eastAsia="Consolas" w:hAnsi="Consolas" w:cs="Consolas"/>
+        <w:t xml:space="preserve"> </w:t>
+      </w:r>
+      <w:r>
+        <w:rPr>
+          <w:rFonts w:ascii="Consolas" w:hAnsi="Consolas" w:cs="Consolas"/>
           <w:sz w:val="18"/>
           <w:szCs w:val="18"/>
-        </w:rPr>
-        <w:t xml:space="preserve">                                              │                            </w:t>
-      </w:r>
-      <w:r>
-        <w:rPr>
-          <w:rFonts w:ascii="Consolas" w:eastAsia="Consolas" w:hAnsi="Consolas" w:cs="Consolas"/>
-        </w:rPr>
-        <w:br/>
+          <w:lang w:eastAsia="zh-CN"/>
+        </w:rPr>
+        <w:t>retrieval</w:t>
       </w:r>
       <w:r>
         <w:rPr>
@@ -3019,21 +3067,16 @@
           <w:sz w:val="18"/>
           <w:szCs w:val="18"/>
         </w:rPr>
-        <w:t xml:space="preserve">                                              ▼                            </w:t>
-      </w:r>
-      <w:r>
-        <w:rPr>
-          <w:rFonts w:ascii="Consolas" w:eastAsia="Consolas" w:hAnsi="Consolas" w:cs="Consolas"/>
-        </w:rPr>
-        <w:br/>
-      </w:r>
-      <w:r>
-        <w:rPr>
-          <w:rFonts w:ascii="Consolas" w:eastAsia="Consolas" w:hAnsi="Consolas" w:cs="Consolas"/>
+        <w:t xml:space="preserve">                    </w:t>
+      </w:r>
+      <w:r>
+        <w:rPr>
+          <w:rFonts w:ascii="Consolas" w:hAnsi="Consolas" w:cs="Consolas" w:hint="eastAsia"/>
           <w:sz w:val="18"/>
           <w:szCs w:val="18"/>
-        </w:rPr>
-        <w:t xml:space="preserve">                                [M4] assemble context with chunk_id tags   </w:t>
+          <w:lang w:eastAsia="zh-CN"/>
+        </w:rPr>
+        <w:t xml:space="preserve">  </w:t>
       </w:r>
       <w:r>
         <w:rPr>
@@ -3047,7 +3090,7 @@
           <w:sz w:val="18"/>
           <w:szCs w:val="18"/>
         </w:rPr>
-        <w:t xml:space="preserve">                                              │                            </w:t>
+        <w:t xml:space="preserve">                                │                                          </w:t>
       </w:r>
       <w:r>
         <w:rPr>
@@ -3061,7 +3104,7 @@
           <w:sz w:val="18"/>
           <w:szCs w:val="18"/>
         </w:rPr>
-        <w:t xml:space="preserve">                                              ▼                            </w:t>
+        <w:t xml:space="preserve">   question ───▶  embed ──────▶ search  ──▶ filter: item ∈ allow-list    </w:t>
       </w:r>
       <w:r>
         <w:rPr>
@@ -3075,7 +3118,7 @@
           <w:sz w:val="18"/>
           <w:szCs w:val="18"/>
         </w:rPr>
-        <w:t xml:space="preserve">                                LLM (strict JSON: answer · citations ·     </w:t>
+        <w:t xml:space="preserve">                                              │                            </w:t>
       </w:r>
       <w:r>
         <w:rPr>
@@ -3089,7 +3132,7 @@
           <w:sz w:val="18"/>
           <w:szCs w:val="18"/>
         </w:rPr>
-        <w:t xml:space="preserve">                                  refused)                                 </w:t>
+        <w:t xml:space="preserve">                                              ▼                            </w:t>
       </w:r>
       <w:r>
         <w:rPr>
@@ -3103,35 +3146,25 @@
           <w:sz w:val="18"/>
           <w:szCs w:val="18"/>
         </w:rPr>
-        <w:t xml:space="preserve">                                              │                            </w:t>
-      </w:r>
-      <w:r>
-        <w:rPr>
-          <w:rFonts w:ascii="Consolas" w:eastAsia="Consolas" w:hAnsi="Consolas" w:cs="Consolas"/>
-        </w:rPr>
-        <w:br/>
-      </w:r>
+        <w:t xml:space="preserve">                                [M4] assemble context with </w:t>
+      </w:r>
+      <w:proofErr w:type="spellStart"/>
       <w:r>
         <w:rPr>
           <w:rFonts w:ascii="Consolas" w:eastAsia="Consolas" w:hAnsi="Consolas" w:cs="Consolas"/>
           <w:sz w:val="18"/>
           <w:szCs w:val="18"/>
         </w:rPr>
-        <w:t xml:space="preserve">                                              ▼                            </w:t>
-      </w:r>
-      <w:r>
-        <w:rPr>
-          <w:rFonts w:ascii="Consolas" w:eastAsia="Consolas" w:hAnsi="Consolas" w:cs="Consolas"/>
-        </w:rPr>
-        <w:br/>
-      </w:r>
+        <w:t>chunk_id</w:t>
+      </w:r>
+      <w:proofErr w:type="spellEnd"/>
       <w:r>
         <w:rPr>
           <w:rFonts w:ascii="Consolas" w:eastAsia="Consolas" w:hAnsi="Consolas" w:cs="Consolas"/>
           <w:sz w:val="18"/>
           <w:szCs w:val="18"/>
         </w:rPr>
-        <w:t xml:space="preserve">                                [M5] eval: Recall@k · citation coverage ·  </w:t>
+        <w:t xml:space="preserve"> tags   </w:t>
       </w:r>
       <w:r>
         <w:rPr>
@@ -3145,7 +3178,199 @@
           <w:sz w:val="18"/>
           <w:szCs w:val="18"/>
         </w:rPr>
-        <w:t xml:space="preserve">                                  LLM-judge hallucination · leakage=0      </w:t>
+        <w:t xml:space="preserve">                                              │                            </w:t>
+      </w:r>
+      <w:r>
+        <w:rPr>
+          <w:rFonts w:ascii="Consolas" w:eastAsia="Consolas" w:hAnsi="Consolas" w:cs="Consolas"/>
+        </w:rPr>
+        <w:br/>
+      </w:r>
+      <w:r>
+        <w:rPr>
+          <w:rFonts w:ascii="Consolas" w:eastAsia="Consolas" w:hAnsi="Consolas" w:cs="Consolas"/>
+          <w:sz w:val="18"/>
+          <w:szCs w:val="18"/>
+        </w:rPr>
+        <w:t xml:space="preserve">                                              ▼                            </w:t>
+      </w:r>
+      <w:r>
+        <w:rPr>
+          <w:rFonts w:ascii="Consolas" w:eastAsia="Consolas" w:hAnsi="Consolas" w:cs="Consolas"/>
+        </w:rPr>
+        <w:br/>
+      </w:r>
+      <w:r>
+        <w:rPr>
+          <w:rFonts w:ascii="Consolas" w:eastAsia="Consolas" w:hAnsi="Consolas" w:cs="Consolas"/>
+          <w:sz w:val="18"/>
+          <w:szCs w:val="18"/>
+        </w:rPr>
+        <w:t xml:space="preserve">                                LLM (strict JSON: answer · citations ·     </w:t>
+      </w:r>
+      <w:r>
+        <w:rPr>
+          <w:rFonts w:ascii="Consolas" w:eastAsia="Consolas" w:hAnsi="Consolas" w:cs="Consolas"/>
+        </w:rPr>
+        <w:br/>
+      </w:r>
+      <w:r>
+        <w:rPr>
+          <w:rFonts w:ascii="Consolas" w:eastAsia="Consolas" w:hAnsi="Consolas" w:cs="Consolas"/>
+          <w:sz w:val="18"/>
+          <w:szCs w:val="18"/>
+        </w:rPr>
+        <w:t xml:space="preserve">                                  refused)                                 </w:t>
+      </w:r>
+      <w:r>
+        <w:rPr>
+          <w:rFonts w:ascii="Consolas" w:eastAsia="Consolas" w:hAnsi="Consolas" w:cs="Consolas"/>
+        </w:rPr>
+        <w:br/>
+      </w:r>
+      <w:r>
+        <w:rPr>
+          <w:rFonts w:ascii="Consolas" w:eastAsia="Consolas" w:hAnsi="Consolas" w:cs="Consolas"/>
+          <w:sz w:val="18"/>
+          <w:szCs w:val="18"/>
+        </w:rPr>
+        <w:t xml:space="preserve">                                              │                            </w:t>
+      </w:r>
+      <w:r>
+        <w:rPr>
+          <w:rFonts w:ascii="Consolas" w:eastAsia="Consolas" w:hAnsi="Consolas" w:cs="Consolas"/>
+        </w:rPr>
+        <w:br/>
+      </w:r>
+      <w:r>
+        <w:rPr>
+          <w:rFonts w:ascii="Consolas" w:eastAsia="Consolas" w:hAnsi="Consolas" w:cs="Consolas"/>
+          <w:sz w:val="18"/>
+          <w:szCs w:val="18"/>
+        </w:rPr>
+        <w:t xml:space="preserve">                                              ▼                            </w:t>
+      </w:r>
+      <w:r>
+        <w:rPr>
+          <w:rFonts w:ascii="Consolas" w:eastAsia="Consolas" w:hAnsi="Consolas" w:cs="Consolas"/>
+        </w:rPr>
+        <w:br/>
+      </w:r>
+      <w:r>
+        <w:rPr>
+          <w:rFonts w:ascii="Consolas" w:eastAsia="Consolas" w:hAnsi="Consolas" w:cs="Consolas"/>
+          <w:sz w:val="18"/>
+          <w:szCs w:val="18"/>
+        </w:rPr>
+        <w:t xml:space="preserve">                                </w:t>
+      </w:r>
+      <w:r>
+        <w:rPr>
+          <w:rFonts w:ascii="Consolas" w:eastAsia="Consolas" w:hAnsi="Consolas" w:cs="Consolas"/>
+          <w:sz w:val="18"/>
+          <w:szCs w:val="18"/>
+        </w:rPr>
+        <w:t xml:space="preserve">[M5] eval: </w:t>
+      </w:r>
+      <w:proofErr w:type="spellStart"/>
+      <w:r>
+        <w:rPr>
+          <w:rFonts w:ascii="Consolas" w:eastAsia="Consolas" w:hAnsi="Consolas" w:cs="Consolas"/>
+          <w:sz w:val="18"/>
+          <w:szCs w:val="18"/>
+        </w:rPr>
+        <w:t>Recall@k</w:t>
+      </w:r>
+      <w:proofErr w:type="spellEnd"/>
+      <w:r>
+        <w:rPr>
+          <w:rFonts w:ascii="Consolas" w:eastAsia="Consolas" w:hAnsi="Consolas" w:cs="Consolas"/>
+          <w:sz w:val="18"/>
+          <w:szCs w:val="18"/>
+        </w:rPr>
+        <w:t xml:space="preserve"> · citation coverage ·</w:t>
+      </w:r>
+      <w:r>
+        <w:rPr>
+          <w:rFonts w:ascii="Consolas" w:hAnsi="Consolas" w:cs="Consolas" w:hint="eastAsia"/>
+          <w:sz w:val="18"/>
+          <w:szCs w:val="18"/>
+          <w:lang w:eastAsia="zh-CN"/>
+        </w:rPr>
+        <w:t xml:space="preserve">  </w:t>
+      </w:r>
+      <w:r>
+        <w:rPr>
+          <w:rFonts w:ascii="Consolas" w:eastAsia="Consolas" w:hAnsi="Consolas" w:cs="Consolas"/>
+        </w:rPr>
+        <w:br/>
+      </w:r>
+      <w:r>
+        <w:rPr>
+          <w:rFonts w:ascii="Consolas" w:eastAsia="Consolas" w:hAnsi="Consolas" w:cs="Consolas"/>
+          <w:sz w:val="18"/>
+          <w:szCs w:val="18"/>
+        </w:rPr>
+        <w:t xml:space="preserve">                                  </w:t>
+      </w:r>
+      <w:r>
+        <w:rPr>
+          <w:rFonts w:ascii="Consolas" w:eastAsia="Consolas" w:hAnsi="Consolas" w:cs="Consolas"/>
+          <w:sz w:val="18"/>
+          <w:szCs w:val="18"/>
+        </w:rPr>
+        <w:t>LLM-judge hallucination</w:t>
+      </w:r>
+      <w:r>
+        <w:rPr>
+          <w:rFonts w:ascii="Consolas" w:eastAsia="Consolas" w:hAnsi="Consolas" w:cs="Consolas"/>
+          <w:sz w:val="18"/>
+          <w:szCs w:val="18"/>
+        </w:rPr>
+        <w:t xml:space="preserve"> · leakage=0</w:t>
+      </w:r>
+      <w:r>
+        <w:rPr>
+          <w:rFonts w:ascii="Consolas" w:eastAsia="Consolas" w:hAnsi="Consolas" w:cs="Consolas"/>
+          <w:sz w:val="18"/>
+          <w:szCs w:val="18"/>
+        </w:rPr>
+        <w:t xml:space="preserve"> </w:t>
+      </w:r>
+      <w:r>
+        <w:rPr>
+          <w:rFonts w:ascii="Consolas" w:hAnsi="Consolas" w:cs="Consolas" w:hint="eastAsia"/>
+          <w:sz w:val="18"/>
+          <w:szCs w:val="18"/>
+          <w:lang w:eastAsia="zh-CN"/>
+        </w:rPr>
+        <w:t xml:space="preserve"> </w:t>
+      </w:r>
+      <w:r>
+        <w:rPr>
+          <w:rFonts w:ascii="Consolas" w:eastAsia="Consolas" w:hAnsi="Consolas" w:cs="Consolas"/>
+          <w:sz w:val="18"/>
+          <w:szCs w:val="18"/>
+        </w:rPr>
+        <w:t xml:space="preserve"> </w:t>
+      </w:r>
+      <w:r>
+        <w:rPr>
+          <w:rFonts w:ascii="Consolas" w:hAnsi="Consolas" w:cs="Consolas"/>
+          <w:sz w:val="18"/>
+          <w:szCs w:val="18"/>
+          <w:lang w:eastAsia="zh-CN"/>
+        </w:rPr>
+        <w:tab/>
+      </w:r>
+      <w:r>
+        <w:rPr>
+          <w:rFonts w:ascii="Consolas" w:hAnsi="Consolas" w:cs="Consolas" w:hint="eastAsia"/>
+          <w:sz w:val="18"/>
+          <w:szCs w:val="18"/>
+          <w:lang w:eastAsia="zh-CN"/>
+        </w:rPr>
+        <w:t xml:space="preserve">  </w:t>
       </w:r>
     </w:p>
     <w:p>
@@ -3174,7 +3399,23 @@
         <w:t xml:space="preserve">BeautifulSoup + lxml for HTML parsing. </w:t>
       </w:r>
       <w:r>
-        <w:t>Handles malformed SEC HTML better than html.parser and is faster than pure-Python parsers.</w:t>
+        <w:t xml:space="preserve">Handles malformed SEC HTML better than </w:t>
+      </w:r>
+      <w:proofErr w:type="gramStart"/>
+      <w:r>
+        <w:t>html.parser</w:t>
+      </w:r>
+      <w:proofErr w:type="gramEnd"/>
+      <w:r>
+        <w:t xml:space="preserve"> and </w:t>
+      </w:r>
+      <w:proofErr w:type="gramStart"/>
+      <w:r>
+        <w:t>is</w:t>
+      </w:r>
+      <w:proofErr w:type="gramEnd"/>
+      <w:r>
+        <w:t xml:space="preserve"> faster than pure-Python parsers.</w:t>
       </w:r>
     </w:p>
     <w:p>
@@ -3191,10 +3432,25 @@
           <w:b/>
           <w:bCs/>
         </w:rPr>
-        <w:t xml:space="preserve">tiktoken cl100k_base for token counting. </w:t>
-      </w:r>
-      <w:r>
-        <w:t>Matches GPT-3.5/4/4o tokenization so generation-context budgets are accurate.</w:t>
+        <w:t>Approximate token-aware chunking.</w:t>
+      </w:r>
+      <w:r>
+        <w:rPr>
+          <w:b/>
+          <w:bCs/>
+        </w:rPr>
+        <w:t xml:space="preserve"> </w:t>
+      </w:r>
+      <w:r>
+        <w:t xml:space="preserve">Uses whitespace-based token estimates to control chunk size and context length; future versions can replace this with </w:t>
+      </w:r>
+      <w:proofErr w:type="spellStart"/>
+      <w:r>
+        <w:t>tiktoken</w:t>
+      </w:r>
+      <w:proofErr w:type="spellEnd"/>
+      <w:r>
+        <w:t xml:space="preserve"> for model-specific token accounting.</w:t>
       </w:r>
     </w:p>
     <w:p>
@@ -3231,10 +3487,10 @@
           <w:b/>
           <w:bCs/>
         </w:rPr>
-        <w:t xml:space="preserve">FAISS IndexFlatIP. </w:t>
-      </w:r>
-      <w:r>
-        <w:t>Cosine on normalized vectors, exact search, no index-tuning required for a corpus this small.</w:t>
+        <w:t xml:space="preserve">Cosine similarity over normalized embedding vectors. </w:t>
+      </w:r>
+      <w:r>
+        <w:t>Uses a lightweight embedding matrix and exact similarity search, which is sufficient for this project-scale corpus and avoids additional vector-database dependencies.</w:t>
       </w:r>
     </w:p>
     <w:p>
@@ -3274,7 +3530,17 @@
         <w:t xml:space="preserve">Hard allow-list filter, not prompt instruction. </w:t>
       </w:r>
       <w:r>
-        <w:t>Section scoping is enforced by filtering candidates by metadata.item after FAISS search. The LLM never sees out-of-scope text, so it cannot accidentally cite it.</w:t>
+        <w:t xml:space="preserve">Section scoping is enforced by filtering retrieved candidates using </w:t>
+      </w:r>
+      <w:proofErr w:type="spellStart"/>
+      <w:proofErr w:type="gramStart"/>
+      <w:r>
+        <w:t>metadata.item</w:t>
+      </w:r>
+      <w:proofErr w:type="spellEnd"/>
+      <w:proofErr w:type="gramEnd"/>
+      <w:r>
+        <w:t xml:space="preserve"> before answer generation. The LLM only receives in-scope retrieved text, reducing the risk of unsupported or out-of-scope citations.</w:t>
       </w:r>
     </w:p>
     <w:p>
@@ -3308,12 +3574,6 @@
         <w:gridCol w:w="7960"/>
       </w:tblGrid>
       <w:tr>
-        <w:tblPrEx>
-          <w:tblCellMar>
-            <w:top w:w="0" w:type="dxa"/>
-            <w:bottom w:w="0" w:type="dxa"/>
-          </w:tblCellMar>
-        </w:tblPrEx>
         <w:tc>
           <w:tcPr>
             <w:tcW w:w="1400" w:type="dxa"/>
@@ -3370,12 +3630,6 @@
         </w:tc>
       </w:tr>
       <w:tr>
-        <w:tblPrEx>
-          <w:tblCellMar>
-            <w:top w:w="0" w:type="dxa"/>
-            <w:bottom w:w="0" w:type="dxa"/>
-          </w:tblCellMar>
-        </w:tblPrEx>
         <w:tc>
           <w:tcPr>
             <w:tcW w:w="1400" w:type="dxa"/>
@@ -3420,18 +3674,20 @@
           </w:tcPr>
           <w:p>
             <w:r>
-              <w:t>This brief + section-extraction pipeline producing clean Item 6/7/7A/8 JSONL.</w:t>
+              <w:t xml:space="preserve">This brief + section-extraction pipeline </w:t>
+            </w:r>
+            <w:proofErr w:type="gramStart"/>
+            <w:r>
+              <w:t>producing</w:t>
+            </w:r>
+            <w:proofErr w:type="gramEnd"/>
+            <w:r>
+              <w:t xml:space="preserve"> clean Item 6/7/7A/8 JSONL.</w:t>
             </w:r>
           </w:p>
         </w:tc>
       </w:tr>
       <w:tr>
-        <w:tblPrEx>
-          <w:tblCellMar>
-            <w:top w:w="0" w:type="dxa"/>
-            <w:bottom w:w="0" w:type="dxa"/>
-          </w:tblCellMar>
-        </w:tblPrEx>
         <w:tc>
           <w:tcPr>
             <w:tcW w:w="1400" w:type="dxa"/>
@@ -3476,18 +3732,36 @@
           </w:tcPr>
           <w:p>
             <w:r>
-              <w:t>Token-aware chunks with full metadata (cik, ticker, year, item, chunk_id, token_count); chunk-distribution report.</w:t>
+              <w:t>Approximate token-aware chunks with full metadata (</w:t>
+            </w:r>
+            <w:proofErr w:type="spellStart"/>
+            <w:r>
+              <w:t>cik</w:t>
+            </w:r>
+            <w:proofErr w:type="spellEnd"/>
+            <w:r>
+              <w:t xml:space="preserve">, ticker, year, item, </w:t>
+            </w:r>
+            <w:proofErr w:type="spellStart"/>
+            <w:r>
+              <w:t>chunk_id</w:t>
+            </w:r>
+            <w:proofErr w:type="spellEnd"/>
+            <w:r>
+              <w:t xml:space="preserve">, </w:t>
+            </w:r>
+            <w:proofErr w:type="spellStart"/>
+            <w:r>
+              <w:t>token_count</w:t>
+            </w:r>
+            <w:proofErr w:type="spellEnd"/>
+            <w:r>
+              <w:t>); chunk-distribution report.</w:t>
             </w:r>
           </w:p>
         </w:tc>
       </w:tr>
       <w:tr>
-        <w:tblPrEx>
-          <w:tblCellMar>
-            <w:top w:w="0" w:type="dxa"/>
-            <w:bottom w:w="0" w:type="dxa"/>
-          </w:tblCellMar>
-        </w:tblPrEx>
         <w:tc>
           <w:tcPr>
             <w:tcW w:w="1400" w:type="dxa"/>
@@ -3532,18 +3806,23 @@
           </w:tcPr>
           <w:p>
             <w:r>
-              <w:t>FAISS index + retrieve() with hard Item allow-list; zero-leakage sanity probes.</w:t>
+              <w:t xml:space="preserve">In-memory embedding matrix + cosine-similarity </w:t>
+            </w:r>
+            <w:proofErr w:type="gramStart"/>
+            <w:r>
+              <w:t>retrieve(</w:t>
+            </w:r>
+            <w:proofErr w:type="gramEnd"/>
+            <w:r>
+              <w:t>)</w:t>
+            </w:r>
+            <w:r>
+              <w:t xml:space="preserve"> with hard Item allow-list; zero-leakage sanity probes.</w:t>
             </w:r>
           </w:p>
         </w:tc>
       </w:tr>
       <w:tr>
-        <w:tblPrEx>
-          <w:tblCellMar>
-            <w:top w:w="0" w:type="dxa"/>
-            <w:bottom w:w="0" w:type="dxa"/>
-          </w:tblCellMar>
-        </w:tblPrEx>
         <w:tc>
           <w:tcPr>
             <w:tcW w:w="1400" w:type="dxa"/>
@@ -3588,18 +3867,20 @@
           </w:tcPr>
           <w:p>
             <w:r>
-              <w:t>rag_answer() with JSON contract, explicit chunk_id + Item citations, and refusal logic. 15 questions × 15–20 firms = 225–300 answers.</w:t>
+              <w:t>rag_</w:t>
+            </w:r>
+            <w:proofErr w:type="gramStart"/>
+            <w:r>
+              <w:t>answer(</w:t>
+            </w:r>
+            <w:proofErr w:type="gramEnd"/>
+            <w:r>
+              <w:t>) with JSON contract, explicit chunk_id + Item citations, and refusal logic. 15 questions × 15–20 firms = 225–300 answers.</w:t>
             </w:r>
           </w:p>
         </w:tc>
       </w:tr>
       <w:tr>
-        <w:tblPrEx>
-          <w:tblCellMar>
-            <w:top w:w="0" w:type="dxa"/>
-            <w:bottom w:w="0" w:type="dxa"/>
-          </w:tblCellMar>
-        </w:tblPrEx>
         <w:tc>
           <w:tcPr>
             <w:tcW w:w="1400" w:type="dxa"/>
@@ -3644,7 +3925,29 @@
           </w:tcPr>
           <w:p>
             <w:r>
-              <w:t>20 labeled Q→chunk pairs; Hit@k, citation coverage, LLM-judge hallucination estimate, leakage=0 assertion; architecture diagram; reflection on limitations.</w:t>
+              <w:t xml:space="preserve">20 labeled </w:t>
+            </w:r>
+            <w:proofErr w:type="spellStart"/>
+            <w:r>
+              <w:t>Q→chunk</w:t>
+            </w:r>
+            <w:proofErr w:type="spellEnd"/>
+            <w:r>
+              <w:t xml:space="preserve"> pairs; </w:t>
+            </w:r>
+            <w:proofErr w:type="spellStart"/>
+            <w:r>
+              <w:t>Hit@k</w:t>
+            </w:r>
+            <w:proofErr w:type="spellEnd"/>
+            <w:r>
+              <w:t xml:space="preserve">, citation coverage, </w:t>
+            </w:r>
+            <w:r>
+              <w:t>LLM-as-judge hallucination estimate</w:t>
+            </w:r>
+            <w:r>
+              <w:t>, leakage=0 assertion; architecture diagram; reflection on limitations.</w:t>
             </w:r>
           </w:p>
         </w:tc>
@@ -3673,10 +3976,19 @@
           <w:b/>
           <w:bCs/>
         </w:rPr>
+        <w:lastRenderedPageBreak/>
         <w:t xml:space="preserve">Retrieval accuracy. </w:t>
       </w:r>
       <w:r>
-        <w:t>Hit@5 and Recall@5 on 20 human-labeled (question, gold chunk_id) pairs.</w:t>
+        <w:t xml:space="preserve">Hit@5 and </w:t>
+      </w:r>
+      <w:proofErr w:type="gramStart"/>
+      <w:r>
+        <w:t>Recall</w:t>
+      </w:r>
+      <w:proofErr w:type="gramEnd"/>
+      <w:r>
+        <w:t>@5 on 20 human-labeled (question, gold chunk_id) pairs.</w:t>
       </w:r>
     </w:p>
     <w:p>
@@ -3696,7 +4008,21 @@
         <w:t xml:space="preserve">Grounding reliability. </w:t>
       </w:r>
       <w:r>
-        <w:t>Citation coverage (fraction of non-refused answers citing ≥1 chunk). LLM-as-judge hallucination estimate on a 10% sample of answers.</w:t>
+        <w:t xml:space="preserve">Citation coverage measures the fraction of non-refused answers citing ≥1 chunk. </w:t>
+      </w:r>
+      <w:r>
+        <w:t xml:space="preserve">LLM-as-judge hallucination </w:t>
+      </w:r>
+      <w:proofErr w:type="gramStart"/>
+      <w:r>
+        <w:t>estimate</w:t>
+      </w:r>
+      <w:r>
+        <w:t xml:space="preserve"> checks</w:t>
+      </w:r>
+      <w:proofErr w:type="gramEnd"/>
+      <w:r>
+        <w:t xml:space="preserve"> whether sampled answers are fully supported by their cited chunks.</w:t>
       </w:r>
     </w:p>
     <w:p>
@@ -3713,11 +4039,26 @@
           <w:b/>
           <w:bCs/>
         </w:rPr>
-        <w:lastRenderedPageBreak/>
         <w:t xml:space="preserve">Section integrity. </w:t>
       </w:r>
       <w:r>
-        <w:t>Sweep all generated answers; assert every citation.item ∈ {Item 6, 7, 7A, 8}. A single violation fails the run.</w:t>
+        <w:t xml:space="preserve">Sweep all generated answers; assert every </w:t>
+      </w:r>
+      <w:proofErr w:type="gramStart"/>
+      <w:r>
+        <w:t>citation.item</w:t>
+      </w:r>
+      <w:proofErr w:type="gramEnd"/>
+      <w:r>
+        <w:t xml:space="preserve"> ∈ {Item 6, 7, 7A, </w:t>
+      </w:r>
+      <w:proofErr w:type="gramStart"/>
+      <w:r>
+        <w:t>8}.</w:t>
+      </w:r>
+      <w:proofErr w:type="gramEnd"/>
+      <w:r>
+        <w:t xml:space="preserve"> A single violation fails the run.</w:t>
       </w:r>
     </w:p>
     <w:p>
@@ -3737,7 +4078,15 @@
         <w:t xml:space="preserve">Refusal calibration. </w:t>
       </w:r>
       <w:r>
-        <w:t>Distribution of top-1 similarity scores for refused vs answered; used to tune MIN_SIM threshold.</w:t>
+        <w:t xml:space="preserve">Distribution of </w:t>
+      </w:r>
+      <w:proofErr w:type="gramStart"/>
+      <w:r>
+        <w:t>top-1</w:t>
+      </w:r>
+      <w:proofErr w:type="gramEnd"/>
+      <w:r>
+        <w:t xml:space="preserve"> similarity scores for refused vs answered; used to tune MIN_SIM threshold.</w:t>
       </w:r>
     </w:p>
     <w:p>
@@ -3826,7 +4175,36 @@
         <w:t xml:space="preserve">Ground-truth labels. </w:t>
       </w:r>
       <w:r>
-        <w:t>The M5 label set must be human-generated for a trustworthy Recall@k; the notebook bootstraps placeholders but does not claim they are evaluation-grade.</w:t>
+        <w:t xml:space="preserve">The evaluation set uses human-labeled </w:t>
+      </w:r>
+      <w:proofErr w:type="spellStart"/>
+      <w:r>
+        <w:t>Q→chunk</w:t>
+      </w:r>
+      <w:proofErr w:type="spellEnd"/>
+      <w:r>
+        <w:t xml:space="preserve"> pairs for trustworthy </w:t>
+      </w:r>
+      <w:proofErr w:type="spellStart"/>
+      <w:r>
+        <w:t>Hit@k</w:t>
+      </w:r>
+      <w:proofErr w:type="spellEnd"/>
+      <w:r>
+        <w:t xml:space="preserve"> and </w:t>
+      </w:r>
+      <w:proofErr w:type="spellStart"/>
+      <w:proofErr w:type="gramStart"/>
+      <w:r>
+        <w:t>Recall</w:t>
+      </w:r>
+      <w:proofErr w:type="gramEnd"/>
+      <w:r>
+        <w:t>@k</w:t>
+      </w:r>
+      <w:proofErr w:type="spellEnd"/>
+      <w:r>
+        <w:t xml:space="preserve"> measurement. Placeholder rows generated by the notebook are not treated as final evaluation labels until manually verified.</w:t>
       </w:r>
     </w:p>
     <w:p>
@@ -3852,7 +4230,23 @@
           <w:b/>
           <w:bCs/>
         </w:rPr>
-        <w:t xml:space="preserve">This design brief. </w:t>
+        <w:t xml:space="preserve">This design </w:t>
+      </w:r>
+      <w:proofErr w:type="gramStart"/>
+      <w:r>
+        <w:rPr>
+          <w:b/>
+          <w:bCs/>
+        </w:rPr>
+        <w:t>brief</w:t>
+      </w:r>
+      <w:proofErr w:type="gramEnd"/>
+      <w:r>
+        <w:rPr>
+          <w:b/>
+          <w:bCs/>
+        </w:rPr>
+        <w:t xml:space="preserve">. </w:t>
       </w:r>
       <w:r>
         <w:t>Milestone1_Design_Brief.docx (2–4 pages as required).</w:t>
@@ -4276,10 +4670,10 @@
   <w:docDefaults>
     <w:rPrDefault>
       <w:rPr>
-        <w:rFonts w:ascii="Calibri" w:eastAsia="Calibri" w:hAnsi="Calibri" w:cs="Calibri"/>
+        <w:rFonts w:ascii="Calibri" w:eastAsiaTheme="minorEastAsia" w:hAnsi="Calibri" w:cs="Calibri"/>
         <w:sz w:val="22"/>
         <w:szCs w:val="22"/>
-        <w:lang w:val="en-DE" w:eastAsia="en-GB" w:bidi="ar-SA"/>
+        <w:lang w:val="en-US" w:eastAsia="en-GB" w:bidi="ar-SA"/>
       </w:rPr>
     </w:rPrDefault>
     <w:pPrDefault/>
@@ -4758,7 +5152,6 @@
   <w:style w:type="character" w:default="1" w:styleId="DefaultParagraphFont">
     <w:name w:val="Default Paragraph Font"/>
     <w:uiPriority w:val="1"/>
-    <w:semiHidden/>
     <w:unhideWhenUsed/>
   </w:style>
   <w:style w:type="table" w:default="1" w:styleId="TableNormal">

</xml_diff>